<commit_message>
feat(press): Promo-Video in 4 Sprachen + aktualisierte Pressetexte
Media-Kit-ZIPs neu gepackt (inkl. Video).

Co-Authored-By: Claude Opus 5.5 <noreply@anthropic.com>
</commit_message>
<xml_diff>
--- a/press/downloads/de/BiSi_Gruendergeschichte_DE.docx
+++ b/press/downloads/de/BiSi_Gruendergeschichte_DE.docx
@@ -42,7 +42,7 @@
     </w:p>
     <w:p>
       <w:r>
-        <w:t>Aus diesen Abenden wird in rund einem Monat BiSi: Buzz it, Say it, Martins erste eigene App und ein kleiner Traum, der wahr geworden ist. Eine App, die bewusst keine Daten sammelt: „Bei uns stimmen die Menschen in der Runde ab, nicht ein KI-Modell. Mensch und Spaß stehen im Vordergrund.“</w:t>
+        <w:t>Aus diesen Abenden wird in rund einem Monat BiSi: Buzz it, Say it, Martins erste eigene App und ein kleiner Traum, der wahr geworden ist. Seine zweite App folgt: PantoMeGo, Pantomime für Familien und Kinder. Beide stehen für dieselbe Überzeugung: Das Handy bleibt im Hintergrund – der Spaß gehört den Menschen am Tisch.</w:t>
       </w:r>
     </w:p>
     <w:p>
@@ -193,7 +193,7 @@
     </w:p>
     <w:p>
       <w:r>
-        <w:t>In Belgien haben die Kinder gezeigt, wie viel Spaß schon die Kleinsten am Buzzern haben. Deshalb ist die nächste Idee schon da: eine Version mit Symbolen statt Buchstaben, für alle, die noch nicht lesen können. Damit noch mehr Menschen an einem Tisch zusammenkommen und das Handy einfach nur der Buzzer ist.</w:t>
+        <w:t>In Belgien haben die Kinder gezeigt, wie viel Spaß schon die Kleinsten am Buzzern haben. Das war die Inspiration für Martins zweite App: PantoMeGo, eine Pantomime-App für Familien und Kinder auf iPhone und iPad. Drei Schwierigkeitsstufen von Bambini bis Profis, fünf Kategorien, vier Sprachen – und dieselbe Philosophie: Das Handy zeigt den Begriff, gespielt wird mit Körper, Mimik und echtem Miteinander. Mehr unter pantomego.app.</w:t>
       </w:r>
     </w:p>
     <w:p>

</xml_diff>